<commit_message>
Actualiza fechas de convocatoria Innova
</commit_message>
<xml_diff>
--- a/assets/docs/convocatoria-2026-2027.docx
+++ b/assets/docs/convocatoria-2026-2027.docx
@@ -250,7 +250,7 @@
                 <w:sz w:val="26"/>
                 <w:szCs w:val="26"/>
               </w:rPr>
-              <w:t xml:space="preserve">21 ago 2026</w:t>
+              <w:t xml:space="preserve">28 ago 2026</w:t>
             </w:r>
           </w:p>
           <w:p>
@@ -1029,7 +1029,7 @@
                 <w:sz w:val="22"/>
                 <w:szCs w:val="22"/>
               </w:rPr>
-              <w:t xml:space="preserve">19 de agosto de 2026</w:t>
+              <w:t xml:space="preserve">26 de agosto de 2026</w:t>
             </w:r>
           </w:p>
         </w:tc>
@@ -1149,7 +1149,7 @@
                 <w:sz w:val="22"/>
                 <w:szCs w:val="22"/>
               </w:rPr>
-              <w:t xml:space="preserve">21 de agosto de 2026</w:t>
+              <w:t xml:space="preserve">28 de agosto de 2026</w:t>
             </w:r>
           </w:p>
         </w:tc>

</xml_diff>